<commit_message>
Add FastAPI backend and Streamlit frontend
- backend: POST /query + GET /health with Pydantic-validated I/O
  and CORS for local dev. Thin wrapper around run_query().
- frontend: 3-panel Streamlit dashboard (holdings | query | answer)
  with 5 sample-query buttons, session_state-based active-query
  handoff, 60s cached holdings fetch.
- 3 backend tests via FastAPI TestClient (mocked agent).

End-to-end loop works: browser click -> FastAPI -> LangGraph agent
-> tool selection -> live data -> rendered answer in ~7-15s.

23 tests passing total. Build is ~72h ahead of the 7-day plan.

/stream endpoint deferred per "ship what works" rule.

Co-Authored-By: Claude Opus 4.7 <noreply@anthropic.com>
</commit_message>
<xml_diff>
--- a/docs/portfoliopilot-logbook.docx
+++ b/docs/portfoliopilot-logbook.docx
@@ -2295,6 +2295,317 @@
         <w:t xml:space="preserve">Concrete proof that the @tool wrapper pattern + create_react_agent is the right level of abstraction for a finance agent prototype — production teams can adopt or replace either layer independently</w:t>
       </w:r>
     </w:p>
+    <w:p>
+      <w:r>
+        <w:br w:type="page"/>
+      </w:r>
+    </w:p>
+    <w:p>
+      <w:pPr>
+        <w:pStyle w:val="Heading1"/>
+      </w:pPr>
+      <w:r>
+        <w:t xml:space="preserve">Day 5 — June 2, 2026 (built early)</w:t>
+      </w:r>
+    </w:p>
+    <w:p>
+      <w:pPr>
+        <w:spacing w:after="120"/>
+      </w:pPr>
+      <w:r>
+        <w:t xml:space="preserve">Day 5 was completed in the same session as Days 2-4. The project is now ~72 hours ahead of plan. With the FastAPI backend and Streamlit frontend in place, PortfolioPilot is end-to-end operable — a PM can type a question in the browser and get an agent-generated answer back. Only polish, deploy, and demo work remain.</w:t>
+      </w:r>
+    </w:p>
+    <w:p>
+      <w:pPr>
+        <w:pStyle w:val="Heading2"/>
+      </w:pPr>
+      <w:r>
+        <w:t xml:space="preserve">Goal</w:t>
+      </w:r>
+    </w:p>
+    <w:p>
+      <w:pPr>
+        <w:spacing w:after="120"/>
+      </w:pPr>
+      <w:r>
+        <w:t xml:space="preserve">Ship the FastAPI backend (POST /query, GET /health) and the 3-panel Streamlit dashboard, with end-to-end integration verified locally.</w:t>
+      </w:r>
+    </w:p>
+    <w:p>
+      <w:pPr>
+        <w:pStyle w:val="Heading2"/>
+      </w:pPr>
+      <w:r>
+        <w:t xml:space="preserve">What we did</w:t>
+      </w:r>
+    </w:p>
+    <w:p>
+      <w:pPr>
+        <w:pStyle w:val="ListParagraph"/>
+        <w:numPr>
+          <w:ilvl w:val="0"/>
+          <w:numId w:val="2"/>
+        </w:numPr>
+      </w:pPr>
+      <w:r>
+        <w:t xml:space="preserve">backend/main.py: FastAPI app with Pydantic-validated POST /query and GET /health endpoints; CORS middleware for local-dev cross-port calls; explicit try/except around the agent call so the worker returns 500 instead of crashing</w:t>
+      </w:r>
+    </w:p>
+    <w:p>
+      <w:pPr>
+        <w:pStyle w:val="ListParagraph"/>
+        <w:numPr>
+          <w:ilvl w:val="0"/>
+          <w:numId w:val="2"/>
+        </w:numPr>
+      </w:pPr>
+      <w:r>
+        <w:t xml:space="preserve">frontend/app.py: 3-column Streamlit dashboard — holdings table on the left (live, 60s cached), free-text question + 5 sample-query buttons in the middle, agent answer + tools-called footer on the right</w:t>
+      </w:r>
+    </w:p>
+    <w:p>
+      <w:pPr>
+        <w:pStyle w:val="ListParagraph"/>
+        <w:numPr>
+          <w:ilvl w:val="0"/>
+          <w:numId w:val="2"/>
+        </w:numPr>
+      </w:pPr>
+      <w:r>
+        <w:t xml:space="preserve">session_state-based 'active query' pattern so both the Send button and sample buttons trigger the same agent call in the answer column</w:t>
+      </w:r>
+    </w:p>
+    <w:p>
+      <w:pPr>
+        <w:pStyle w:val="ListParagraph"/>
+        <w:numPr>
+          <w:ilvl w:val="0"/>
+          <w:numId w:val="2"/>
+        </w:numPr>
+      </w:pPr>
+      <w:r>
+        <w:t xml:space="preserve">httpx client with 120s timeout (multi-tool agent calls can take 20-40s); error handling that surfaces agent errors as red boxes in the UI</w:t>
+      </w:r>
+    </w:p>
+    <w:p>
+      <w:pPr>
+        <w:pStyle w:val="ListParagraph"/>
+        <w:numPr>
+          <w:ilvl w:val="0"/>
+          <w:numId w:val="2"/>
+        </w:numPr>
+      </w:pPr>
+      <w:r>
+        <w:t xml:space="preserve">@st.cache_data(ttl=60) on the holdings fetch so Streamlit reruns don't hammer yfinance</w:t>
+      </w:r>
+    </w:p>
+    <w:p>
+      <w:pPr>
+        <w:pStyle w:val="ListParagraph"/>
+        <w:numPr>
+          <w:ilvl w:val="0"/>
+          <w:numId w:val="2"/>
+        </w:numPr>
+      </w:pPr>
+      <w:r>
+        <w:t xml:space="preserve">3 backend tests via FastAPI TestClient: health probe, query routing (with mocked agent), and validation rejection of empty queries</w:t>
+      </w:r>
+    </w:p>
+    <w:p>
+      <w:pPr>
+        <w:pStyle w:val="Heading2"/>
+      </w:pPr>
+      <w:r>
+        <w:t xml:space="preserve">Why we built it this way</w:t>
+      </w:r>
+    </w:p>
+    <w:p>
+      <w:pPr>
+        <w:spacing w:after="120"/>
+      </w:pPr>
+      <w:r>
+        <w:t xml:space="preserve">Two processes (FastAPI + Streamlit) instead of bundling the agent inside Streamlit. Reason: it demonstrates clean separation of concerns and makes the architecture interview-explainable. FastAPI is the API layer the agent would expose in production (consumed by any frontend, automation, or other service); Streamlit is one of many possible clients. The repo shows both.</w:t>
+      </w:r>
+    </w:p>
+    <w:p>
+      <w:pPr>
+        <w:spacing w:after="120"/>
+      </w:pPr>
+      <w:r>
+        <w:t xml:space="preserve">Skipped the planned /stream endpoint. SSE would add complexity (different response type, retry handling, client-side parsing) for a feature that's not visible in a 90-second demo. Documented as a production-path consideration in future-work.md.</w:t>
+      </w:r>
+    </w:p>
+    <w:p>
+      <w:pPr>
+        <w:spacing w:after="120"/>
+      </w:pPr>
+      <w:r>
+        <w:t xml:space="preserve">Mocked the agent in the backend tests. API tests are about HTTP behavior — routing, status codes, request shapes, validation. Whether the agent gives a good answer is the agent module's concern, tested separately in test_agent.py. This separation keeps API tests free, fast, deterministic, and CI-friendly.</w:t>
+      </w:r>
+    </w:p>
+    <w:p>
+      <w:pPr>
+        <w:spacing w:after="120"/>
+      </w:pPr>
+      <w:r>
+        <w:t xml:space="preserve">Used session_state for the query handoff between the middle and right columns. Streamlit re-runs the entire script on every interaction, so a local variable in the middle column would not survive into the right column's render. session_state is the right primitive for this exact pattern and demonstrates intentional Streamlit usage.</w:t>
+      </w:r>
+    </w:p>
+    <w:p>
+      <w:pPr>
+        <w:pStyle w:val="Heading2"/>
+      </w:pPr>
+      <w:r>
+        <w:t xml:space="preserve">Day 5 outcomes (live, today)</w:t>
+      </w:r>
+    </w:p>
+    <w:p>
+      <w:pPr>
+        <w:shd w:fill="F2F2F2" w:val="clear"/>
+        <w:spacing w:after="120"/>
+      </w:pPr>
+      <w:r>
+        <w:rPr>
+          <w:rFonts w:ascii="Courier New" w:cs="Courier New" w:eastAsia="Courier New" w:hAnsi="Courier New"/>
+          <w:sz w:val="20"/>
+          <w:szCs w:val="20"/>
+        </w:rPr>
+        <w:t xml:space="preserve">uvicorn backend.main:app --reload --port 8000  →  alive</w:t>
+      </w:r>
+    </w:p>
+    <w:p>
+      <w:pPr>
+        <w:shd w:fill="F2F2F2" w:val="clear"/>
+        <w:spacing w:after="120"/>
+      </w:pPr>
+      <w:r>
+        <w:rPr>
+          <w:rFonts w:ascii="Courier New" w:cs="Courier New" w:eastAsia="Courier New" w:hAnsi="Courier New"/>
+          <w:sz w:val="20"/>
+          <w:szCs w:val="20"/>
+        </w:rPr>
+        <w:t xml:space="preserve">curl localhost:8000/health                     →  {"status":"ok"}</w:t>
+      </w:r>
+    </w:p>
+    <w:p>
+      <w:pPr>
+        <w:shd w:fill="F2F2F2" w:val="clear"/>
+        <w:spacing w:after="120"/>
+      </w:pPr>
+      <w:r>
+        <w:rPr>
+          <w:rFonts w:ascii="Courier New" w:cs="Courier New" w:eastAsia="Courier New" w:hAnsi="Courier New"/>
+          <w:sz w:val="20"/>
+          <w:szCs w:val="20"/>
+        </w:rPr>
+        <w:t xml:space="preserve">curl -X POST localhost:8000/query ...          →  full JSON response in ~7s</w:t>
+      </w:r>
+    </w:p>
+    <w:p>
+      <w:pPr>
+        <w:shd w:fill="F2F2F2" w:val="clear"/>
+        <w:spacing w:after="120"/>
+      </w:pPr>
+      <w:r>
+        <w:rPr>
+          <w:rFonts w:ascii="Courier New" w:cs="Courier New" w:eastAsia="Courier New" w:hAnsi="Courier New"/>
+          <w:sz w:val="20"/>
+          <w:szCs w:val="20"/>
+        </w:rPr>
+        <w:t xml:space="preserve">streamlit run frontend/app.py                  →  http://localhost:8501 (3-panel dashboard)</w:t>
+      </w:r>
+    </w:p>
+    <w:p>
+      <w:pPr>
+        <w:shd w:fill="F2F2F2" w:val="clear"/>
+        <w:spacing w:after="120"/>
+      </w:pPr>
+      <w:r>
+        <w:rPr>
+          <w:rFonts w:ascii="Courier New" w:cs="Courier New" w:eastAsia="Courier New" w:hAnsi="Courier New"/>
+          <w:sz w:val="20"/>
+          <w:szCs w:val="20"/>
+        </w:rPr>
+        <w:t xml:space="preserve">pytest tests/test_backend.py -v                →  3 passed in &lt;1s</w:t>
+      </w:r>
+    </w:p>
+    <w:p>
+      <w:pPr>
+        <w:spacing w:after="120"/>
+      </w:pPr>
+      <w:r>
+        <w:t xml:space="preserve">End-to-end demo verified: clicking 'What's the news on my holdings?' in the browser produced a per-ticker sentiment breakdown plus cross-portfolio themes, with 'Tools used: summarize_holdings_news' confirming correct routing. The full agentic loop — browser click → HTTP POST → FastAPI → LangGraph agent → tool selection → yfinance + GPT-4o-mini → rendered answer — runs in 7-15 seconds.</w:t>
+      </w:r>
+    </w:p>
+    <w:p>
+      <w:pPr>
+        <w:pStyle w:val="Heading2"/>
+      </w:pPr>
+      <w:r>
+        <w:t xml:space="preserve">What we got out of it</w:t>
+      </w:r>
+    </w:p>
+    <w:p>
+      <w:pPr>
+        <w:pStyle w:val="ListParagraph"/>
+        <w:numPr>
+          <w:ilvl w:val="0"/>
+          <w:numId w:val="2"/>
+        </w:numPr>
+      </w:pPr>
+      <w:r>
+        <w:t xml:space="preserve">PortfolioPilot is now a complete demoable product — anyone with the repo can run two commands and click through the dashboard</w:t>
+      </w:r>
+    </w:p>
+    <w:p>
+      <w:pPr>
+        <w:pStyle w:val="ListParagraph"/>
+        <w:numPr>
+          <w:ilvl w:val="0"/>
+          <w:numId w:val="2"/>
+        </w:numPr>
+      </w:pPr>
+      <w:r>
+        <w:t xml:space="preserve">23 tests passing across the full project (~45s runtime)</w:t>
+      </w:r>
+    </w:p>
+    <w:p>
+      <w:pPr>
+        <w:pStyle w:val="ListParagraph"/>
+        <w:numPr>
+          <w:ilvl w:val="0"/>
+          <w:numId w:val="2"/>
+        </w:numPr>
+      </w:pPr>
+      <w:r>
+        <w:t xml:space="preserve">FastAPI's auto-generated /docs Swagger UI provides visual proof of clean API design — a useful interview artifact</w:t>
+      </w:r>
+    </w:p>
+    <w:p>
+      <w:pPr>
+        <w:pStyle w:val="ListParagraph"/>
+        <w:numPr>
+          <w:ilvl w:val="0"/>
+          <w:numId w:val="2"/>
+        </w:numPr>
+      </w:pPr>
+      <w:r>
+        <w:t xml:space="preserve">Three full days ahead of the 7-day plan; Day 6 (polish, deploy, README) and Day 7 (demo video, outreach) are the remaining work</w:t>
+      </w:r>
+    </w:p>
+    <w:p>
+      <w:pPr>
+        <w:pStyle w:val="ListParagraph"/>
+        <w:numPr>
+          <w:ilvl w:val="0"/>
+          <w:numId w:val="2"/>
+        </w:numPr>
+      </w:pPr>
+      <w:r>
+        <w:t xml:space="preserve">The two-process architecture is honestly defensible at a BlackRock interview: it mirrors how a real Aladdin tool would expose its agent capability behind an internal API, with the UI as just one consumer</w:t>
+      </w:r>
+    </w:p>
     <w:sectPr>
       <w:pgSz w:w="12240" w:h="15840" w:orient="portrait"/>
       <w:pgMar w:top="1440" w:right="1440" w:bottom="1440" w:left="1440" w:header="708" w:footer="708" w:gutter="0"/>

</xml_diff>

<commit_message>
Add Tool 5 (anomalies) and LangGraph agent integration
- anomalies: z-score detection on daily return, volume, intraday range;
  baseline excludes recent window to avoid self-inflation. Defensive
  std=0 handling and length guard. 3 tests.
- agent: LangGraph ReAct agent (create_react_agent) wrapping all 5
  tools via @tool decorators. Lazy-singleton factory. System prompt
  anchors agent to "always call tools, never fabricate". 2 tests
  (1 live LLM routing).

All 5 tools shipped. 20 tests passing total. Build is ~48h ahead
of the 7-day plan; analytical core complete, API + UI remain.

Known: LangGraph v1.0 deprecation warning on create_react_agent
(moves to langchain.agents.create_agent in v2.0, no release date yet).

Co-Authored-By: Claude Opus 4.7 <noreply@anthropic.com>
</commit_message>
<xml_diff>
--- a/docs/portfoliopilot-logbook.docx
+++ b/docs/portfoliopilot-logbook.docx
@@ -1824,6 +1824,477 @@
         <w:t xml:space="preserve">Working scenario primitive (beta × market + sector overlay) that scales: adding a 'tech sell-off' or 'inflation surprise' scenario is now just a dict entry</w:t>
       </w:r>
     </w:p>
+    <w:p>
+      <w:r>
+        <w:br w:type="page"/>
+      </w:r>
+    </w:p>
+    <w:p>
+      <w:pPr>
+        <w:pStyle w:val="Heading1"/>
+      </w:pPr>
+      <w:r>
+        <w:t xml:space="preserve">Day 4 — June 2, 2026 (built early)</w:t>
+      </w:r>
+    </w:p>
+    <w:p>
+      <w:pPr>
+        <w:spacing w:after="120"/>
+      </w:pPr>
+      <w:r>
+        <w:t xml:space="preserve">Day 4 was completed in the same session as Day 3. The project is now ~48 hours ahead of the 7-day plan. With 5 tools and a working agent, the analytical core of PortfolioPilot is done — what remains is the API + UI layer (Day 5) and polish + deploy (Days 6-7).</w:t>
+      </w:r>
+    </w:p>
+    <w:p>
+      <w:pPr>
+        <w:pStyle w:val="Heading2"/>
+      </w:pPr>
+      <w:r>
+        <w:t xml:space="preserve">Goal</w:t>
+      </w:r>
+    </w:p>
+    <w:p>
+      <w:pPr>
+        <w:spacing w:after="120"/>
+      </w:pPr>
+      <w:r>
+        <w:t xml:space="preserve">Ship Tool 5 (anomaly detection) and integrate all 5 tools behind a LangGraph ReAct agent. Confirm the agent autonomously routes user questions to the correct tools.</w:t>
+      </w:r>
+    </w:p>
+    <w:p>
+      <w:pPr>
+        <w:pStyle w:val="Heading2"/>
+      </w:pPr>
+      <w:r>
+        <w:t xml:space="preserve">What we did — Tool 5 (anomalies)</w:t>
+      </w:r>
+    </w:p>
+    <w:p>
+      <w:pPr>
+        <w:pStyle w:val="ListParagraph"/>
+        <w:numPr>
+          <w:ilvl w:val="0"/>
+          <w:numId w:val="2"/>
+        </w:numPr>
+      </w:pPr>
+      <w:r>
+        <w:t xml:space="preserve">Defined a 3-signal anomaly framework: daily return, volume, and intraday range ((High-Low)/Close) — complementary signals that catch different anomaly types</w:t>
+      </w:r>
+    </w:p>
+    <w:p>
+      <w:pPr>
+        <w:pStyle w:val="ListParagraph"/>
+        <w:numPr>
+          <w:ilvl w:val="0"/>
+          <w:numId w:val="2"/>
+        </w:numPr>
+      </w:pPr>
+      <w:r>
+        <w:t xml:space="preserve">_fetch_price_volume — pulls ~90 days of OHLCV per ticker; flattens the MultiIndex columns yfinance returns in 0.2.40+</w:t>
+      </w:r>
+    </w:p>
+    <w:p>
+      <w:pPr>
+        <w:pStyle w:val="ListParagraph"/>
+        <w:numPr>
+          <w:ilvl w:val="0"/>
+          <w:numId w:val="2"/>
+        </w:numPr>
+      </w:pPr>
+      <w:r>
+        <w:t xml:space="preserve">_compute_zscores — builds the 3 signal series, splits into baseline (older) and recent (last 5 days) windows that do not overlap, computes z = (recent - baseline_mean) / baseline_std with defensive std=0 handling</w:t>
+      </w:r>
+    </w:p>
+    <w:p>
+      <w:pPr>
+        <w:pStyle w:val="ListParagraph"/>
+        <w:numPr>
+          <w:ilvl w:val="0"/>
+          <w:numId w:val="2"/>
+        </w:numPr>
+      </w:pPr>
+      <w:r>
+        <w:t xml:space="preserve">flag_anomalies — runs the pipeline across all holdings, flags |z| &gt; 2.0, reconstructs the raw underlying values so the output is interpretable (a z-score alone is not actionable), sorts by absolute z descending</w:t>
+      </w:r>
+    </w:p>
+    <w:p>
+      <w:pPr>
+        <w:pStyle w:val="ListParagraph"/>
+        <w:numPr>
+          <w:ilvl w:val="0"/>
+          <w:numId w:val="2"/>
+        </w:numPr>
+      </w:pPr>
+      <w:r>
+        <w:t xml:space="preserve">3 unit tests: synthetic spike detection (deterministic), short-history guard, live end-to-end pipeline shape check</w:t>
+      </w:r>
+    </w:p>
+    <w:p>
+      <w:pPr>
+        <w:pStyle w:val="Heading2"/>
+      </w:pPr>
+      <w:r>
+        <w:t xml:space="preserve">What we did — agent integration</w:t>
+      </w:r>
+    </w:p>
+    <w:p>
+      <w:pPr>
+        <w:pStyle w:val="ListParagraph"/>
+        <w:numPr>
+          <w:ilvl w:val="0"/>
+          <w:numId w:val="2"/>
+        </w:numPr>
+      </w:pPr>
+      <w:r>
+        <w:t xml:space="preserve">agent/portfoliopilot_agent.py wraps each of the 5 tools with @tool decorators; docstrings become the LLM-facing tool descriptions</w:t>
+      </w:r>
+    </w:p>
+    <w:p>
+      <w:pPr>
+        <w:pStyle w:val="ListParagraph"/>
+        <w:numPr>
+          <w:ilvl w:val="0"/>
+          <w:numId w:val="2"/>
+        </w:numPr>
+      </w:pPr>
+      <w:r>
+        <w:t xml:space="preserve">Uses langgraph.prebuilt.create_react_agent for the ReAct loop — zero custom loop code</w:t>
+      </w:r>
+    </w:p>
+    <w:p>
+      <w:pPr>
+        <w:pStyle w:val="ListParagraph"/>
+        <w:numPr>
+          <w:ilvl w:val="0"/>
+          <w:numId w:val="2"/>
+        </w:numPr>
+      </w:pPr>
+      <w:r>
+        <w:t xml:space="preserve">System prompt with 5 explicit rules; the most important is 'always call tools, never fabricate numbers' — the single largest failure mode for LLM agents in finance</w:t>
+      </w:r>
+    </w:p>
+    <w:p>
+      <w:pPr>
+        <w:pStyle w:val="ListParagraph"/>
+        <w:numPr>
+          <w:ilvl w:val="0"/>
+          <w:numId w:val="2"/>
+        </w:numPr>
+      </w:pPr>
+      <w:r>
+        <w:t xml:space="preserve">Lazy-singleton agent factory (_get_agent) so the agent is built once and reused; ~50ms saved per query after the first</w:t>
+      </w:r>
+    </w:p>
+    <w:p>
+      <w:pPr>
+        <w:pStyle w:val="ListParagraph"/>
+        <w:numPr>
+          <w:ilvl w:val="0"/>
+          <w:numId w:val="2"/>
+        </w:numPr>
+      </w:pPr>
+      <w:r>
+        <w:t xml:space="preserve">run_query(question) returns both the final answer and the list of tools the agent actually called — the latter feeds the Day 6 eval suite</w:t>
+      </w:r>
+    </w:p>
+    <w:p>
+      <w:pPr>
+        <w:pStyle w:val="ListParagraph"/>
+        <w:numPr>
+          <w:ilvl w:val="0"/>
+          <w:numId w:val="2"/>
+        </w:numPr>
+      </w:pPr>
+      <w:r>
+        <w:t xml:space="preserve">2 tests: tool-inventory shape check (free) + one live LLM-routing test that asserts a 'composition' question triggers get_portfolio_holdings</w:t>
+      </w:r>
+    </w:p>
+    <w:p>
+      <w:pPr>
+        <w:pStyle w:val="Heading2"/>
+      </w:pPr>
+      <w:r>
+        <w:t xml:space="preserve">Why we built it this way</w:t>
+      </w:r>
+    </w:p>
+    <w:p>
+      <w:pPr>
+        <w:spacing w:after="120"/>
+      </w:pPr>
+      <w:r>
+        <w:t xml:space="preserve">Three signals together, not just price. Volume spikes often precede price moves (institutional accumulation); intraday range expansion catches days where the close looks normal but the underlying day was chaotic. A PM scanning the output sees both what is anomalous and which signal flagged it.</w:t>
+      </w:r>
+    </w:p>
+    <w:p>
+      <w:pPr>
+        <w:spacing w:after="120"/>
+      </w:pPr>
+      <w:r>
+        <w:t xml:space="preserve">Baseline window excludes the recent window. If today is included in its own baseline, today's spike inflates the mean and dampens its own z-score. Standard time-series practice, easy to get wrong.</w:t>
+      </w:r>
+    </w:p>
+    <w:p>
+      <w:pPr>
+        <w:spacing w:after="120"/>
+      </w:pPr>
+      <w:r>
+        <w:t xml:space="preserve">Reconstructing the raw values (return %, volume count, range) in the output — z-scores alone are not actionable. A +3 sigma z-score on a 0.5% absolute move is noise; the same z-score on a 5% move is a real signal. Including both lets the PM judge.</w:t>
+      </w:r>
+    </w:p>
+    <w:p>
+      <w:pPr>
+        <w:spacing w:after="120"/>
+      </w:pPr>
+      <w:r>
+        <w:t xml:space="preserve">Used create_react_agent from langgraph.prebuilt rather than hand-rolling the reason-act-observe loop. The prebuilt is battle-tested, handles error recovery, and lets us focus on the things that actually matter for product quality: tool design, descriptions, and the system prompt.</w:t>
+      </w:r>
+    </w:p>
+    <w:p>
+      <w:pPr>
+        <w:spacing w:after="120"/>
+      </w:pPr>
+      <w:r>
+        <w:t xml:space="preserve">Tool docstrings are the LLM's tool descriptions. The model picks tools based on what those docstrings say, so they need to be written for the model, not for the developer reading the code. Concrete, complete, and free of jargon the model would not understand.</w:t>
+      </w:r>
+    </w:p>
+    <w:p>
+      <w:pPr>
+        <w:pStyle w:val="Heading2"/>
+      </w:pPr>
+      <w:r>
+        <w:t xml:space="preserve">Day 4 outcomes (live data, today)</w:t>
+      </w:r>
+    </w:p>
+    <w:p>
+      <w:pPr>
+        <w:shd w:fill="F2F2F2" w:val="clear"/>
+        <w:spacing w:after="120"/>
+      </w:pPr>
+      <w:r>
+        <w:rPr>
+          <w:rFonts w:ascii="Courier New" w:cs="Courier New" w:eastAsia="Courier New" w:hAnsi="Courier New"/>
+          <w:sz w:val="20"/>
+          <w:szCs w:val="20"/>
+        </w:rPr>
+        <w:t xml:space="preserve">Tool 5: Scanned 10 holdings, flagged 19 anomalies</w:t>
+      </w:r>
+    </w:p>
+    <w:p>
+      <w:pPr>
+        <w:shd w:fill="F2F2F2" w:val="clear"/>
+        <w:spacing w:after="120"/>
+      </w:pPr>
+      <w:r>
+        <w:rPr>
+          <w:rFonts w:ascii="Courier New" w:cs="Courier New" w:eastAsia="Courier New" w:hAnsi="Courier New"/>
+          <w:sz w:val="20"/>
+          <w:szCs w:val="20"/>
+        </w:rPr>
+        <w:t xml:space="preserve">Most extreme: MSFT volume z=+5.36 on 2026-05-29 (with return +5.45% and range +3.99%)</w:t>
+      </w:r>
+    </w:p>
+    <w:p>
+      <w:pPr>
+        <w:shd w:fill="F2F2F2" w:val="clear"/>
+        <w:spacing w:after="120"/>
+      </w:pPr>
+      <w:r>
+        <w:rPr>
+          <w:rFonts w:ascii="Courier New" w:cs="Courier New" w:eastAsia="Courier New" w:hAnsi="Courier New"/>
+          <w:sz w:val="20"/>
+          <w:szCs w:val="20"/>
+        </w:rPr>
+        <w:t xml:space="preserve">NVDA volume z=+3.89 on same day — sector-wide AI news signature</w:t>
+      </w:r>
+    </w:p>
+    <w:p>
+      <w:pPr>
+        <w:shd w:fill="F2F2F2" w:val="clear"/>
+        <w:spacing w:after="120"/>
+      </w:pPr>
+      <w:r>
+        <w:rPr>
+          <w:rFonts w:ascii="Courier New" w:cs="Courier New" w:eastAsia="Courier New" w:hAnsi="Courier New"/>
+          <w:sz w:val="20"/>
+          <w:szCs w:val="20"/>
+        </w:rPr>
+        <w:t xml:space="preserve"/>
+      </w:r>
+    </w:p>
+    <w:p>
+      <w:pPr>
+        <w:shd w:fill="F2F2F2" w:val="clear"/>
+        <w:spacing w:after="120"/>
+      </w:pPr>
+      <w:r>
+        <w:rPr>
+          <w:rFonts w:ascii="Courier New" w:cs="Courier New" w:eastAsia="Courier New" w:hAnsi="Courier New"/>
+          <w:sz w:val="20"/>
+          <w:szCs w:val="20"/>
+        </w:rPr>
+        <w:t xml:space="preserve">Agent routing test (4 sample queries):</w:t>
+      </w:r>
+    </w:p>
+    <w:p>
+      <w:pPr>
+        <w:shd w:fill="F2F2F2" w:val="clear"/>
+        <w:spacing w:after="120"/>
+      </w:pPr>
+      <w:r>
+        <w:rPr>
+          <w:rFonts w:ascii="Courier New" w:cs="Courier New" w:eastAsia="Courier New" w:hAnsi="Courier New"/>
+          <w:sz w:val="20"/>
+          <w:szCs w:val="20"/>
+        </w:rPr>
+        <w:t xml:space="preserve">  'What's in my portfolio?'       -&gt; ['get_portfolio_holdings']</w:t>
+      </w:r>
+    </w:p>
+    <w:p>
+      <w:pPr>
+        <w:shd w:fill="F2F2F2" w:val="clear"/>
+        <w:spacing w:after="120"/>
+      </w:pPr>
+      <w:r>
+        <w:rPr>
+          <w:rFonts w:ascii="Courier New" w:cs="Courier New" w:eastAsia="Courier New" w:hAnsi="Courier New"/>
+          <w:sz w:val="20"/>
+          <w:szCs w:val="20"/>
+        </w:rPr>
+        <w:t xml:space="preserve">  'What's the risk?'              -&gt; ['calculate_risk_metrics']</w:t>
+      </w:r>
+    </w:p>
+    <w:p>
+      <w:pPr>
+        <w:shd w:fill="F2F2F2" w:val="clear"/>
+        <w:spacing w:after="120"/>
+      </w:pPr>
+      <w:r>
+        <w:rPr>
+          <w:rFonts w:ascii="Courier New" w:cs="Courier New" w:eastAsia="Courier New" w:hAnsi="Courier New"/>
+          <w:sz w:val="20"/>
+          <w:szCs w:val="20"/>
+        </w:rPr>
+        <w:t xml:space="preserve">  'What happens if rates spike?'  -&gt; ['run_scenario_analysis']</w:t>
+      </w:r>
+    </w:p>
+    <w:p>
+      <w:pPr>
+        <w:shd w:fill="F2F2F2" w:val="clear"/>
+        <w:spacing w:after="120"/>
+      </w:pPr>
+      <w:r>
+        <w:rPr>
+          <w:rFonts w:ascii="Courier New" w:cs="Courier New" w:eastAsia="Courier New" w:hAnsi="Courier New"/>
+          <w:sz w:val="20"/>
+          <w:szCs w:val="20"/>
+        </w:rPr>
+        <w:t xml:space="preserve">  'Anything weird in my book?'    -&gt; ['flag_anomalies']</w:t>
+      </w:r>
+    </w:p>
+    <w:p>
+      <w:pPr>
+        <w:shd w:fill="F2F2F2" w:val="clear"/>
+        <w:spacing w:after="120"/>
+      </w:pPr>
+      <w:r>
+        <w:rPr>
+          <w:rFonts w:ascii="Courier New" w:cs="Courier New" w:eastAsia="Courier New" w:hAnsi="Courier New"/>
+          <w:sz w:val="20"/>
+          <w:szCs w:val="20"/>
+        </w:rPr>
+        <w:t xml:space="preserve"/>
+      </w:r>
+    </w:p>
+    <w:p>
+      <w:pPr>
+        <w:shd w:fill="F2F2F2" w:val="clear"/>
+        <w:spacing w:after="120"/>
+      </w:pPr>
+      <w:r>
+        <w:rPr>
+          <w:rFonts w:ascii="Courier New" w:cs="Courier New" w:eastAsia="Courier New" w:hAnsi="Courier New"/>
+          <w:sz w:val="20"/>
+          <w:szCs w:val="20"/>
+        </w:rPr>
+        <w:t xml:space="preserve">pytest tests/test_anomalies.py tests/test_agent.py -v  →  5 passed in 13.84s</w:t>
+      </w:r>
+    </w:p>
+    <w:p>
+      <w:pPr>
+        <w:spacing w:after="120"/>
+      </w:pPr>
+      <w:r>
+        <w:t xml:space="preserve">4 of 4 routing decisions correct on the first run with no prompt iteration. This validates the tool docstrings + system prompt design. Anomaly output told an internally consistent story — a major MSFT/NVDA event on May 29 with concurrent volume, return, and range spikes, followed by a -4% reversal on June 2.</w:t>
+      </w:r>
+    </w:p>
+    <w:p>
+      <w:pPr>
+        <w:pStyle w:val="Heading2"/>
+      </w:pPr>
+      <w:r>
+        <w:t xml:space="preserve">What we got out of it</w:t>
+      </w:r>
+    </w:p>
+    <w:p>
+      <w:pPr>
+        <w:pStyle w:val="ListParagraph"/>
+        <w:numPr>
+          <w:ilvl w:val="0"/>
+          <w:numId w:val="2"/>
+        </w:numPr>
+      </w:pPr>
+      <w:r>
+        <w:t xml:space="preserve">All 5 planned tools shipped and tested</w:t>
+      </w:r>
+    </w:p>
+    <w:p>
+      <w:pPr>
+        <w:pStyle w:val="ListParagraph"/>
+        <w:numPr>
+          <w:ilvl w:val="0"/>
+          <w:numId w:val="2"/>
+        </w:numPr>
+      </w:pPr>
+      <w:r>
+        <w:t xml:space="preserve">Working LangGraph agent that demonstrably routes natural-language questions to the right tools — this IS the agentic AI capability the BlackRock role asks for</w:t>
+      </w:r>
+    </w:p>
+    <w:p>
+      <w:pPr>
+        <w:pStyle w:val="ListParagraph"/>
+        <w:numPr>
+          <w:ilvl w:val="0"/>
+          <w:numId w:val="2"/>
+        </w:numPr>
+      </w:pPr>
+      <w:r>
+        <w:t xml:space="preserve">20 unit tests passing across the full project (~45s runtime)</w:t>
+      </w:r>
+    </w:p>
+    <w:p>
+      <w:pPr>
+        <w:pStyle w:val="ListParagraph"/>
+        <w:numPr>
+          <w:ilvl w:val="0"/>
+          <w:numId w:val="2"/>
+        </w:numPr>
+      </w:pPr>
+      <w:r>
+        <w:t xml:space="preserve">48 hours ahead of the 7-day plan; the next 3 days are API layer + polish + outreach, all lower-risk than the analytical core that is now done</w:t>
+      </w:r>
+    </w:p>
+    <w:p>
+      <w:pPr>
+        <w:pStyle w:val="ListParagraph"/>
+        <w:numPr>
+          <w:ilvl w:val="0"/>
+          <w:numId w:val="2"/>
+        </w:numPr>
+      </w:pPr>
+      <w:r>
+        <w:t xml:space="preserve">Concrete proof that the @tool wrapper pattern + create_react_agent is the right level of abstraction for a finance agent prototype — production teams can adopt or replace either layer independently</w:t>
+      </w:r>
+    </w:p>
     <w:sectPr>
       <w:pgSz w:w="12240" w:h="15840" w:orient="portrait"/>
       <w:pgMar w:top="1440" w:right="1440" w:bottom="1440" w:left="1440" w:header="708" w:footer="708" w:gutter="0"/>

</xml_diff>